<commit_message>
Finalize end-of-semester documentation and assets
Made-with: Cursor
</commit_message>
<xml_diff>
--- a/report/Smart_Course_Navigator_Streamlit_Report.docx
+++ b/report/Smart_Course_Navigator_Streamlit_Report.docx
@@ -20,7 +20,7 @@
         <w:jc w:val="center"/>
       </w:pPr>
       <w:r>
-        <w:t>Final Year Project - Streamlit Implementation</w:t>
+        <w:t>End of Semester Project - Streamlit Implementation</w:t>
       </w:r>
     </w:p>
     <w:p>
@@ -606,6 +606,298 @@
       </w:r>
     </w:p>
     <w:p>
+      <w:r>
+        <w:t>Figure: Streamlit user interface mock layout.</w:t>
+      </w:r>
+    </w:p>
+    <w:p>
+      <w:r>
+        <w:drawing>
+          <wp:inline xmlns:a="http://schemas.openxmlformats.org/drawingml/2006/main" xmlns:pic="http://schemas.openxmlformats.org/drawingml/2006/picture">
+            <wp:extent cx="5394960" cy="3082082"/>
+            <wp:docPr id="6" name="Picture 6"/>
+            <wp:cNvGraphicFramePr>
+              <a:graphicFrameLocks noChangeAspect="1"/>
+            </wp:cNvGraphicFramePr>
+            <a:graphic>
+              <a:graphicData uri="http://schemas.openxmlformats.org/drawingml/2006/picture">
+                <pic:pic>
+                  <pic:nvPicPr>
+                    <pic:cNvPr id="0" name="01_home.png"/>
+                    <pic:cNvPicPr/>
+                  </pic:nvPicPr>
+                  <pic:blipFill>
+                    <a:blip r:embed="rId14"/>
+                    <a:stretch>
+                      <a:fillRect/>
+                    </a:stretch>
+                  </pic:blipFill>
+                  <pic:spPr>
+                    <a:xfrm>
+                      <a:off x="0" y="0"/>
+                      <a:ext cx="5394960" cy="3082082"/>
+                    </a:xfrm>
+                    <a:prstGeom prst="rect"/>
+                  </pic:spPr>
+                </pic:pic>
+              </a:graphicData>
+            </a:graphic>
+          </wp:inline>
+        </w:drawing>
+      </w:r>
+    </w:p>
+    <w:p>
+      <w:r>
+        <w:t>Figure: Home page with project overview and repository link.</w:t>
+      </w:r>
+    </w:p>
+    <w:p>
+      <w:r>
+        <w:drawing>
+          <wp:inline xmlns:a="http://schemas.openxmlformats.org/drawingml/2006/main" xmlns:pic="http://schemas.openxmlformats.org/drawingml/2006/picture">
+            <wp:extent cx="5394960" cy="5766638"/>
+            <wp:docPr id="7" name="Picture 7"/>
+            <wp:cNvGraphicFramePr>
+              <a:graphicFrameLocks noChangeAspect="1"/>
+            </wp:cNvGraphicFramePr>
+            <a:graphic>
+              <a:graphicData uri="http://schemas.openxmlformats.org/drawingml/2006/picture">
+                <pic:pic>
+                  <pic:nvPicPr>
+                    <pic:cNvPr id="0" name="02_student_prediction.png"/>
+                    <pic:cNvPicPr/>
+                  </pic:nvPicPr>
+                  <pic:blipFill>
+                    <a:blip r:embed="rId15"/>
+                    <a:stretch>
+                      <a:fillRect/>
+                    </a:stretch>
+                  </pic:blipFill>
+                  <pic:spPr>
+                    <a:xfrm>
+                      <a:off x="0" y="0"/>
+                      <a:ext cx="5394960" cy="5766638"/>
+                    </a:xfrm>
+                    <a:prstGeom prst="rect"/>
+                  </pic:spPr>
+                </pic:pic>
+              </a:graphicData>
+            </a:graphic>
+          </wp:inline>
+        </w:drawing>
+      </w:r>
+    </w:p>
+    <w:p>
+      <w:r>
+        <w:t>Figure: Student prediction page with profile inputs and risk analysis controls.</w:t>
+      </w:r>
+    </w:p>
+    <w:p>
+      <w:r>
+        <w:drawing>
+          <wp:inline xmlns:a="http://schemas.openxmlformats.org/drawingml/2006/main" xmlns:pic="http://schemas.openxmlformats.org/drawingml/2006/picture">
+            <wp:extent cx="5394960" cy="5766638"/>
+            <wp:docPr id="8" name="Picture 8"/>
+            <wp:cNvGraphicFramePr>
+              <a:graphicFrameLocks noChangeAspect="1"/>
+            </wp:cNvGraphicFramePr>
+            <a:graphic>
+              <a:graphicData uri="http://schemas.openxmlformats.org/drawingml/2006/picture">
+                <pic:pic>
+                  <pic:nvPicPr>
+                    <pic:cNvPr id="0" name="03_course_analytics_overview.png"/>
+                    <pic:cNvPicPr/>
+                  </pic:nvPicPr>
+                  <pic:blipFill>
+                    <a:blip r:embed="rId16"/>
+                    <a:stretch>
+                      <a:fillRect/>
+                    </a:stretch>
+                  </pic:blipFill>
+                  <pic:spPr>
+                    <a:xfrm>
+                      <a:off x="0" y="0"/>
+                      <a:ext cx="5394960" cy="5766638"/>
+                    </a:xfrm>
+                    <a:prstGeom prst="rect"/>
+                  </pic:spPr>
+                </pic:pic>
+              </a:graphicData>
+            </a:graphic>
+          </wp:inline>
+        </w:drawing>
+      </w:r>
+    </w:p>
+    <w:p>
+      <w:r>
+        <w:t>Figure: Course analytics page showing aggregated table and primary plots.</w:t>
+      </w:r>
+    </w:p>
+    <w:p>
+      <w:r>
+        <w:drawing>
+          <wp:inline xmlns:a="http://schemas.openxmlformats.org/drawingml/2006/main" xmlns:pic="http://schemas.openxmlformats.org/drawingml/2006/picture">
+            <wp:extent cx="5394960" cy="5766638"/>
+            <wp:docPr id="9" name="Picture 9"/>
+            <wp:cNvGraphicFramePr>
+              <a:graphicFrameLocks noChangeAspect="1"/>
+            </wp:cNvGraphicFramePr>
+            <a:graphic>
+              <a:graphicData uri="http://schemas.openxmlformats.org/drawingml/2006/picture">
+                <pic:pic>
+                  <pic:nvPicPr>
+                    <pic:cNvPr id="0" name="04_course_analytics_charts.png"/>
+                    <pic:cNvPicPr/>
+                  </pic:nvPicPr>
+                  <pic:blipFill>
+                    <a:blip r:embed="rId17"/>
+                    <a:stretch>
+                      <a:fillRect/>
+                    </a:stretch>
+                  </pic:blipFill>
+                  <pic:spPr>
+                    <a:xfrm>
+                      <a:off x="0" y="0"/>
+                      <a:ext cx="5394960" cy="5766638"/>
+                    </a:xfrm>
+                    <a:prstGeom prst="rect"/>
+                  </pic:spPr>
+                </pic:pic>
+              </a:graphicData>
+            </a:graphic>
+          </wp:inline>
+        </w:drawing>
+      </w:r>
+    </w:p>
+    <w:p>
+      <w:r>
+        <w:t>Figure: Extended analytics charts for difficulty and GPA-pass relationship.</w:t>
+      </w:r>
+    </w:p>
+    <w:p>
+      <w:r>
+        <w:drawing>
+          <wp:inline xmlns:a="http://schemas.openxmlformats.org/drawingml/2006/main" xmlns:pic="http://schemas.openxmlformats.org/drawingml/2006/picture">
+            <wp:extent cx="5394960" cy="5766638"/>
+            <wp:docPr id="10" name="Picture 10"/>
+            <wp:cNvGraphicFramePr>
+              <a:graphicFrameLocks noChangeAspect="1"/>
+            </wp:cNvGraphicFramePr>
+            <a:graphic>
+              <a:graphicData uri="http://schemas.openxmlformats.org/drawingml/2006/picture">
+                <pic:pic>
+                  <pic:nvPicPr>
+                    <pic:cNvPr id="0" name="05_recommendation_inputs.png"/>
+                    <pic:cNvPicPr/>
+                  </pic:nvPicPr>
+                  <pic:blipFill>
+                    <a:blip r:embed="rId18"/>
+                    <a:stretch>
+                      <a:fillRect/>
+                    </a:stretch>
+                  </pic:blipFill>
+                  <pic:spPr>
+                    <a:xfrm>
+                      <a:off x="0" y="0"/>
+                      <a:ext cx="5394960" cy="5766638"/>
+                    </a:xfrm>
+                    <a:prstGeom prst="rect"/>
+                  </pic:spPr>
+                </pic:pic>
+              </a:graphicData>
+            </a:graphic>
+          </wp:inline>
+        </w:drawing>
+      </w:r>
+    </w:p>
+    <w:p>
+      <w:r>
+        <w:t>Figure: Recommendation page with program, GPA, level, and attendance controls.</w:t>
+      </w:r>
+    </w:p>
+    <w:p>
+      <w:r>
+        <w:drawing>
+          <wp:inline xmlns:a="http://schemas.openxmlformats.org/drawingml/2006/main" xmlns:pic="http://schemas.openxmlformats.org/drawingml/2006/picture">
+            <wp:extent cx="5394960" cy="5766638"/>
+            <wp:docPr id="11" name="Picture 11"/>
+            <wp:cNvGraphicFramePr>
+              <a:graphicFrameLocks noChangeAspect="1"/>
+            </wp:cNvGraphicFramePr>
+            <a:graphic>
+              <a:graphicData uri="http://schemas.openxmlformats.org/drawingml/2006/picture">
+                <pic:pic>
+                  <pic:nvPicPr>
+                    <pic:cNvPr id="0" name="06_model_performance_top.png"/>
+                    <pic:cNvPicPr/>
+                  </pic:nvPicPr>
+                  <pic:blipFill>
+                    <a:blip r:embed="rId19"/>
+                    <a:stretch>
+                      <a:fillRect/>
+                    </a:stretch>
+                  </pic:blipFill>
+                  <pic:spPr>
+                    <a:xfrm>
+                      <a:off x="0" y="0"/>
+                      <a:ext cx="5394960" cy="5766638"/>
+                    </a:xfrm>
+                    <a:prstGeom prst="rect"/>
+                  </pic:spPr>
+                </pic:pic>
+              </a:graphicData>
+            </a:graphic>
+          </wp:inline>
+        </w:drawing>
+      </w:r>
+    </w:p>
+    <w:p>
+      <w:r>
+        <w:t>Figure: Model performance dashboard summary and model comparison chart.</w:t>
+      </w:r>
+    </w:p>
+    <w:p>
+      <w:r>
+        <w:drawing>
+          <wp:inline xmlns:a="http://schemas.openxmlformats.org/drawingml/2006/main" xmlns:pic="http://schemas.openxmlformats.org/drawingml/2006/picture">
+            <wp:extent cx="5394960" cy="5766638"/>
+            <wp:docPr id="12" name="Picture 12"/>
+            <wp:cNvGraphicFramePr>
+              <a:graphicFrameLocks noChangeAspect="1"/>
+            </wp:cNvGraphicFramePr>
+            <a:graphic>
+              <a:graphicData uri="http://schemas.openxmlformats.org/drawingml/2006/picture">
+                <pic:pic>
+                  <pic:nvPicPr>
+                    <pic:cNvPr id="0" name="07_model_performance_detail.png"/>
+                    <pic:cNvPicPr/>
+                  </pic:nvPicPr>
+                  <pic:blipFill>
+                    <a:blip r:embed="rId20"/>
+                    <a:stretch>
+                      <a:fillRect/>
+                    </a:stretch>
+                  </pic:blipFill>
+                  <pic:spPr>
+                    <a:xfrm>
+                      <a:off x="0" y="0"/>
+                      <a:ext cx="5394960" cy="5766638"/>
+                    </a:xfrm>
+                    <a:prstGeom prst="rect"/>
+                  </pic:spPr>
+                </pic:pic>
+              </a:graphicData>
+            </a:graphic>
+          </wp:inline>
+        </w:drawing>
+      </w:r>
+    </w:p>
+    <w:p>
+      <w:r>
+        <w:t>Figure: Feature importance and interpretation guidance section.</w:t>
+      </w:r>
+    </w:p>
+    <w:p>
       <w:pPr>
         <w:pStyle w:val="Heading1"/>
       </w:pPr>
@@ -748,6 +1040,93 @@
     <w:p>
       <w:r>
         <w:t>Appendix A: Directory tree (app.py, pages/, utils/, data/, models/). Appendix B: API-free architecture because Streamlit embeds server logic. Appendix C: evaluation_metrics.json stores raw metrics for audits.</w:t>
+      </w:r>
+    </w:p>
+    <w:p>
+      <w:r>
+        <w:t>Appendix D: Notebook evidence screenshots.</w:t>
+      </w:r>
+    </w:p>
+    <w:p>
+      <w:r>
+        <w:drawing>
+          <wp:inline xmlns:a="http://schemas.openxmlformats.org/drawingml/2006/main" xmlns:pic="http://schemas.openxmlformats.org/drawingml/2006/picture">
+            <wp:extent cx="5394960" cy="1702037"/>
+            <wp:docPr id="13" name="Picture 13"/>
+            <wp:cNvGraphicFramePr>
+              <a:graphicFrameLocks noChangeAspect="1"/>
+            </wp:cNvGraphicFramePr>
+            <a:graphic>
+              <a:graphicData uri="http://schemas.openxmlformats.org/drawingml/2006/picture">
+                <pic:pic>
+                  <pic:nvPicPr>
+                    <pic:cNvPr id="0" name="01_model_metrics_table.png"/>
+                    <pic:cNvPicPr/>
+                  </pic:nvPicPr>
+                  <pic:blipFill>
+                    <a:blip r:embed="rId21"/>
+                    <a:stretch>
+                      <a:fillRect/>
+                    </a:stretch>
+                  </pic:blipFill>
+                  <pic:spPr>
+                    <a:xfrm>
+                      <a:off x="0" y="0"/>
+                      <a:ext cx="5394960" cy="1702037"/>
+                    </a:xfrm>
+                    <a:prstGeom prst="rect"/>
+                  </pic:spPr>
+                </pic:pic>
+              </a:graphicData>
+            </a:graphic>
+          </wp:inline>
+        </w:drawing>
+      </w:r>
+    </w:p>
+    <w:p>
+      <w:r>
+        <w:t>Figure: Notebook model metrics table export.</w:t>
+      </w:r>
+    </w:p>
+    <w:p>
+      <w:r>
+        <w:drawing>
+          <wp:inline xmlns:a="http://schemas.openxmlformats.org/drawingml/2006/main" xmlns:pic="http://schemas.openxmlformats.org/drawingml/2006/picture">
+            <wp:extent cx="5394960" cy="2116103"/>
+            <wp:docPr id="14" name="Picture 14"/>
+            <wp:cNvGraphicFramePr>
+              <a:graphicFrameLocks noChangeAspect="1"/>
+            </wp:cNvGraphicFramePr>
+            <a:graphic>
+              <a:graphicData uri="http://schemas.openxmlformats.org/drawingml/2006/picture">
+                <pic:pic>
+                  <pic:nvPicPr>
+                    <pic:cNvPr id="0" name="02_feature_importance_table.png"/>
+                    <pic:cNvPicPr/>
+                  </pic:nvPicPr>
+                  <pic:blipFill>
+                    <a:blip r:embed="rId22"/>
+                    <a:stretch>
+                      <a:fillRect/>
+                    </a:stretch>
+                  </pic:blipFill>
+                  <pic:spPr>
+                    <a:xfrm>
+                      <a:off x="0" y="0"/>
+                      <a:ext cx="5394960" cy="2116103"/>
+                    </a:xfrm>
+                    <a:prstGeom prst="rect"/>
+                  </pic:spPr>
+                </pic:pic>
+              </a:graphicData>
+            </a:graphic>
+          </wp:inline>
+        </w:drawing>
+      </w:r>
+    </w:p>
+    <w:p>
+      <w:r>
+        <w:t>Figure: Notebook feature importance table export.</w:t>
       </w:r>
     </w:p>
     <w:sectPr>

</xml_diff>

<commit_message>
Update report title page for BI course and IS3B class
Made-with: Cursor
</commit_message>
<xml_diff>
--- a/report/Smart_Course_Navigator_Streamlit_Report.docx
+++ b/report/Smart_Course_Navigator_Streamlit_Report.docx
@@ -28,6 +28,10 @@
         <w:jc w:val="center"/>
       </w:pPr>
       <w:r>
+        <w:t>Course: Business Intelligence (BI)</w:t>
+        <w:br/>
+        <w:t>Class: IS3B</w:t>
+        <w:br/>
         <w:t>University of Mines and Technology (UMaT)</w:t>
         <w:br/>
         <w:t>April 15, 2026</w:t>

</xml_diff>

<commit_message>
Refactor Streamlit runtime context and finalize report assets.
Centralize shared dataset/model/metrics loading for cleaner page architecture, remove placeholder screenshot artifacts, and regenerate the BI IS3B documentation package with UMaT-branded title assets.

Made-with: Cursor
</commit_message>
<xml_diff>
--- a/report/Smart_Course_Navigator_Streamlit_Report.docx
+++ b/report/Smart_Course_Navigator_Streamlit_Report.docx
@@ -2,6 +2,45 @@
 <file path=word/document.xml><?xml version="1.0" encoding="utf-8"?>
 <w:document xmlns:wpc="http://schemas.microsoft.com/office/word/2010/wordprocessingCanvas" xmlns:mo="http://schemas.microsoft.com/office/mac/office/2008/main" xmlns:mc="http://schemas.openxmlformats.org/markup-compatibility/2006" xmlns:mv="urn:schemas-microsoft-com:mac:vml" xmlns:o="urn:schemas-microsoft-com:office:office" xmlns:r="http://schemas.openxmlformats.org/officeDocument/2006/relationships" xmlns:m="http://schemas.openxmlformats.org/officeDocument/2006/math" xmlns:v="urn:schemas-microsoft-com:vml" xmlns:wp14="http://schemas.microsoft.com/office/word/2010/wordprocessingDrawing" xmlns:wp="http://schemas.openxmlformats.org/drawingml/2006/wordprocessingDrawing" xmlns:w10="urn:schemas-microsoft-com:office:word" xmlns:w="http://schemas.openxmlformats.org/wordprocessingml/2006/main" xmlns:w14="http://schemas.microsoft.com/office/word/2010/wordml" xmlns:wpg="http://schemas.microsoft.com/office/word/2010/wordprocessingGroup" xmlns:wpi="http://schemas.microsoft.com/office/word/2010/wordprocessingInk" xmlns:wne="http://schemas.microsoft.com/office/word/2006/wordml" xmlns:wps="http://schemas.microsoft.com/office/word/2010/wordprocessingShape" mc:Ignorable="w14 wp14">
   <w:body>
+    <w:p>
+      <w:pPr>
+        <w:jc w:val="center"/>
+      </w:pPr>
+      <w:r>
+        <w:drawing>
+          <wp:inline xmlns:a="http://schemas.openxmlformats.org/drawingml/2006/main" xmlns:pic="http://schemas.openxmlformats.org/drawingml/2006/picture">
+            <wp:extent cx="1188720" cy="1386840"/>
+            <wp:docPr id="1" name="Picture 1"/>
+            <wp:cNvGraphicFramePr>
+              <a:graphicFrameLocks noChangeAspect="1"/>
+            </wp:cNvGraphicFramePr>
+            <a:graphic>
+              <a:graphicData uri="http://schemas.openxmlformats.org/drawingml/2006/picture">
+                <pic:pic>
+                  <pic:nvPicPr>
+                    <pic:cNvPr id="0" name="umat_logo.jpg"/>
+                    <pic:cNvPicPr/>
+                  </pic:nvPicPr>
+                  <pic:blipFill>
+                    <a:blip r:embed="rId9"/>
+                    <a:stretch>
+                      <a:fillRect/>
+                    </a:stretch>
+                  </pic:blipFill>
+                  <pic:spPr>
+                    <a:xfrm>
+                      <a:off x="0" y="0"/>
+                      <a:ext cx="1188720" cy="1386840"/>
+                    </a:xfrm>
+                    <a:prstGeom prst="rect"/>
+                  </pic:spPr>
+                </pic:pic>
+              </a:graphicData>
+            </a:graphic>
+          </wp:inline>
+        </w:drawing>
+      </w:r>
+    </w:p>
     <w:p>
       <w:pPr>
         <w:jc w:val="center"/>
@@ -164,7 +203,7 @@
         <w:drawing>
           <wp:inline xmlns:a="http://schemas.openxmlformats.org/drawingml/2006/main" xmlns:pic="http://schemas.openxmlformats.org/drawingml/2006/picture">
             <wp:extent cx="5394960" cy="2517648"/>
-            <wp:docPr id="1" name="Picture 1"/>
+            <wp:docPr id="2" name="Picture 2"/>
             <wp:cNvGraphicFramePr>
               <a:graphicFrameLocks noChangeAspect="1"/>
             </wp:cNvGraphicFramePr>
@@ -176,7 +215,7 @@
                     <pic:cNvPicPr/>
                   </pic:nvPicPr>
                   <pic:blipFill>
-                    <a:blip r:embed="rId9"/>
+                    <a:blip r:embed="rId10"/>
                     <a:stretch>
                       <a:fillRect/>
                     </a:stretch>
@@ -200,7 +239,7 @@
         <w:drawing>
           <wp:inline xmlns:a="http://schemas.openxmlformats.org/drawingml/2006/main" xmlns:pic="http://schemas.openxmlformats.org/drawingml/2006/picture">
             <wp:extent cx="5394960" cy="1678432"/>
-            <wp:docPr id="2" name="Picture 2"/>
+            <wp:docPr id="3" name="Picture 3"/>
             <wp:cNvGraphicFramePr>
               <a:graphicFrameLocks noChangeAspect="1"/>
             </wp:cNvGraphicFramePr>
@@ -212,7 +251,7 @@
                     <pic:cNvPicPr/>
                   </pic:nvPicPr>
                   <pic:blipFill>
-                    <a:blip r:embed="rId10"/>
+                    <a:blip r:embed="rId11"/>
                     <a:stretch>
                       <a:fillRect/>
                     </a:stretch>
@@ -488,7 +527,7 @@
         <w:drawing>
           <wp:inline xmlns:a="http://schemas.openxmlformats.org/drawingml/2006/main" xmlns:pic="http://schemas.openxmlformats.org/drawingml/2006/picture">
             <wp:extent cx="5394960" cy="2832354"/>
-            <wp:docPr id="3" name="Picture 3"/>
+            <wp:docPr id="4" name="Picture 4"/>
             <wp:cNvGraphicFramePr>
               <a:graphicFrameLocks noChangeAspect="1"/>
             </wp:cNvGraphicFramePr>
@@ -500,7 +539,7 @@
                     <pic:cNvPicPr/>
                   </pic:nvPicPr>
                   <pic:blipFill>
-                    <a:blip r:embed="rId11"/>
+                    <a:blip r:embed="rId12"/>
                     <a:stretch>
                       <a:fillRect/>
                     </a:stretch>
@@ -524,7 +563,7 @@
         <w:drawing>
           <wp:inline xmlns:a="http://schemas.openxmlformats.org/drawingml/2006/main" xmlns:pic="http://schemas.openxmlformats.org/drawingml/2006/picture">
             <wp:extent cx="5394960" cy="3021178"/>
-            <wp:docPr id="4" name="Picture 4"/>
+            <wp:docPr id="5" name="Picture 5"/>
             <wp:cNvGraphicFramePr>
               <a:graphicFrameLocks noChangeAspect="1"/>
             </wp:cNvGraphicFramePr>
@@ -536,7 +575,7 @@
                     <pic:cNvPicPr/>
                   </pic:nvPicPr>
                   <pic:blipFill>
-                    <a:blip r:embed="rId12"/>
+                    <a:blip r:embed="rId13"/>
                     <a:stretch>
                       <a:fillRect/>
                     </a:stretch>
@@ -578,7 +617,7 @@
         <w:drawing>
           <wp:inline xmlns:a="http://schemas.openxmlformats.org/drawingml/2006/main" xmlns:pic="http://schemas.openxmlformats.org/drawingml/2006/picture">
             <wp:extent cx="5303520" cy="2946400"/>
-            <wp:docPr id="5" name="Picture 5"/>
+            <wp:docPr id="6" name="Picture 6"/>
             <wp:cNvGraphicFramePr>
               <a:graphicFrameLocks noChangeAspect="1"/>
             </wp:cNvGraphicFramePr>
@@ -590,7 +629,7 @@
                     <pic:cNvPicPr/>
                   </pic:nvPicPr>
                   <pic:blipFill>
-                    <a:blip r:embed="rId13"/>
+                    <a:blip r:embed="rId14"/>
                     <a:stretch>
                       <a:fillRect/>
                     </a:stretch>
@@ -611,7 +650,7 @@
     </w:p>
     <w:p>
       <w:r>
-        <w:t>Figure: Streamlit user interface mock layout.</w:t>
+        <w:t>Figure: Streamlit user interface layout.</w:t>
       </w:r>
     </w:p>
     <w:p>
@@ -619,7 +658,7 @@
         <w:drawing>
           <wp:inline xmlns:a="http://schemas.openxmlformats.org/drawingml/2006/main" xmlns:pic="http://schemas.openxmlformats.org/drawingml/2006/picture">
             <wp:extent cx="5394960" cy="3082082"/>
-            <wp:docPr id="6" name="Picture 6"/>
+            <wp:docPr id="7" name="Picture 7"/>
             <wp:cNvGraphicFramePr>
               <a:graphicFrameLocks noChangeAspect="1"/>
             </wp:cNvGraphicFramePr>
@@ -631,7 +670,7 @@
                     <pic:cNvPicPr/>
                   </pic:nvPicPr>
                   <pic:blipFill>
-                    <a:blip r:embed="rId14"/>
+                    <a:blip r:embed="rId15"/>
                     <a:stretch>
                       <a:fillRect/>
                     </a:stretch>
@@ -660,7 +699,7 @@
         <w:drawing>
           <wp:inline xmlns:a="http://schemas.openxmlformats.org/drawingml/2006/main" xmlns:pic="http://schemas.openxmlformats.org/drawingml/2006/picture">
             <wp:extent cx="5394960" cy="5766638"/>
-            <wp:docPr id="7" name="Picture 7"/>
+            <wp:docPr id="8" name="Picture 8"/>
             <wp:cNvGraphicFramePr>
               <a:graphicFrameLocks noChangeAspect="1"/>
             </wp:cNvGraphicFramePr>
@@ -672,7 +711,7 @@
                     <pic:cNvPicPr/>
                   </pic:nvPicPr>
                   <pic:blipFill>
-                    <a:blip r:embed="rId15"/>
+                    <a:blip r:embed="rId16"/>
                     <a:stretch>
                       <a:fillRect/>
                     </a:stretch>
@@ -701,7 +740,7 @@
         <w:drawing>
           <wp:inline xmlns:a="http://schemas.openxmlformats.org/drawingml/2006/main" xmlns:pic="http://schemas.openxmlformats.org/drawingml/2006/picture">
             <wp:extent cx="5394960" cy="5766638"/>
-            <wp:docPr id="8" name="Picture 8"/>
+            <wp:docPr id="9" name="Picture 9"/>
             <wp:cNvGraphicFramePr>
               <a:graphicFrameLocks noChangeAspect="1"/>
             </wp:cNvGraphicFramePr>
@@ -713,7 +752,7 @@
                     <pic:cNvPicPr/>
                   </pic:nvPicPr>
                   <pic:blipFill>
-                    <a:blip r:embed="rId16"/>
+                    <a:blip r:embed="rId17"/>
                     <a:stretch>
                       <a:fillRect/>
                     </a:stretch>
@@ -742,7 +781,7 @@
         <w:drawing>
           <wp:inline xmlns:a="http://schemas.openxmlformats.org/drawingml/2006/main" xmlns:pic="http://schemas.openxmlformats.org/drawingml/2006/picture">
             <wp:extent cx="5394960" cy="5766638"/>
-            <wp:docPr id="9" name="Picture 9"/>
+            <wp:docPr id="10" name="Picture 10"/>
             <wp:cNvGraphicFramePr>
               <a:graphicFrameLocks noChangeAspect="1"/>
             </wp:cNvGraphicFramePr>
@@ -754,7 +793,7 @@
                     <pic:cNvPicPr/>
                   </pic:nvPicPr>
                   <pic:blipFill>
-                    <a:blip r:embed="rId17"/>
+                    <a:blip r:embed="rId18"/>
                     <a:stretch>
                       <a:fillRect/>
                     </a:stretch>
@@ -783,7 +822,7 @@
         <w:drawing>
           <wp:inline xmlns:a="http://schemas.openxmlformats.org/drawingml/2006/main" xmlns:pic="http://schemas.openxmlformats.org/drawingml/2006/picture">
             <wp:extent cx="5394960" cy="5766638"/>
-            <wp:docPr id="10" name="Picture 10"/>
+            <wp:docPr id="11" name="Picture 11"/>
             <wp:cNvGraphicFramePr>
               <a:graphicFrameLocks noChangeAspect="1"/>
             </wp:cNvGraphicFramePr>
@@ -795,7 +834,7 @@
                     <pic:cNvPicPr/>
                   </pic:nvPicPr>
                   <pic:blipFill>
-                    <a:blip r:embed="rId18"/>
+                    <a:blip r:embed="rId19"/>
                     <a:stretch>
                       <a:fillRect/>
                     </a:stretch>
@@ -824,7 +863,7 @@
         <w:drawing>
           <wp:inline xmlns:a="http://schemas.openxmlformats.org/drawingml/2006/main" xmlns:pic="http://schemas.openxmlformats.org/drawingml/2006/picture">
             <wp:extent cx="5394960" cy="5766638"/>
-            <wp:docPr id="11" name="Picture 11"/>
+            <wp:docPr id="12" name="Picture 12"/>
             <wp:cNvGraphicFramePr>
               <a:graphicFrameLocks noChangeAspect="1"/>
             </wp:cNvGraphicFramePr>
@@ -836,7 +875,7 @@
                     <pic:cNvPicPr/>
                   </pic:nvPicPr>
                   <pic:blipFill>
-                    <a:blip r:embed="rId19"/>
+                    <a:blip r:embed="rId20"/>
                     <a:stretch>
                       <a:fillRect/>
                     </a:stretch>
@@ -865,7 +904,7 @@
         <w:drawing>
           <wp:inline xmlns:a="http://schemas.openxmlformats.org/drawingml/2006/main" xmlns:pic="http://schemas.openxmlformats.org/drawingml/2006/picture">
             <wp:extent cx="5394960" cy="5766638"/>
-            <wp:docPr id="12" name="Picture 12"/>
+            <wp:docPr id="13" name="Picture 13"/>
             <wp:cNvGraphicFramePr>
               <a:graphicFrameLocks noChangeAspect="1"/>
             </wp:cNvGraphicFramePr>
@@ -877,7 +916,7 @@
                     <pic:cNvPicPr/>
                   </pic:nvPicPr>
                   <pic:blipFill>
-                    <a:blip r:embed="rId20"/>
+                    <a:blip r:embed="rId21"/>
                     <a:stretch>
                       <a:fillRect/>
                     </a:stretch>
@@ -1056,7 +1095,7 @@
         <w:drawing>
           <wp:inline xmlns:a="http://schemas.openxmlformats.org/drawingml/2006/main" xmlns:pic="http://schemas.openxmlformats.org/drawingml/2006/picture">
             <wp:extent cx="5394960" cy="1702037"/>
-            <wp:docPr id="13" name="Picture 13"/>
+            <wp:docPr id="14" name="Picture 14"/>
             <wp:cNvGraphicFramePr>
               <a:graphicFrameLocks noChangeAspect="1"/>
             </wp:cNvGraphicFramePr>
@@ -1068,7 +1107,7 @@
                     <pic:cNvPicPr/>
                   </pic:nvPicPr>
                   <pic:blipFill>
-                    <a:blip r:embed="rId21"/>
+                    <a:blip r:embed="rId22"/>
                     <a:stretch>
                       <a:fillRect/>
                     </a:stretch>
@@ -1097,7 +1136,7 @@
         <w:drawing>
           <wp:inline xmlns:a="http://schemas.openxmlformats.org/drawingml/2006/main" xmlns:pic="http://schemas.openxmlformats.org/drawingml/2006/picture">
             <wp:extent cx="5394960" cy="2116103"/>
-            <wp:docPr id="14" name="Picture 14"/>
+            <wp:docPr id="15" name="Picture 15"/>
             <wp:cNvGraphicFramePr>
               <a:graphicFrameLocks noChangeAspect="1"/>
             </wp:cNvGraphicFramePr>
@@ -1109,7 +1148,7 @@
                     <pic:cNvPicPr/>
                   </pic:nvPicPr>
                   <pic:blipFill>
-                    <a:blip r:embed="rId22"/>
+                    <a:blip r:embed="rId23"/>
                     <a:stretch>
                       <a:fillRect/>
                     </a:stretch>

</xml_diff>

<commit_message>
Document ML workflow and notebook execution for team handover.
Improve training pipeline and CLI documentation, make the Jupyter notebook run-all friendly with setup/bootstrap guidance, and refresh README/report assets to reflect current dependencies and deliverables.

Made-with: Cursor
</commit_message>
<xml_diff>
--- a/report/Smart_Course_Navigator_Streamlit_Report.docx
+++ b/report/Smart_Course_Navigator_Streamlit_Report.docx
@@ -73,7 +73,7 @@
         <w:br/>
         <w:t>University of Mines and Technology (UMaT)</w:t>
         <w:br/>
-        <w:t>April 15, 2026</w:t>
+        <w:t>April 17, 2026</w:t>
         <w:br/>
         <w:t>GitHub repository: https://github.com/dogahwisdom/smart-course-navigator</w:t>
       </w:r>
@@ -955,6 +955,101 @@
     </w:p>
     <w:p>
       <w:pPr>
+        <w:pStyle w:val="Heading2"/>
+      </w:pPr>
+      <w:r>
+        <w:t>Business Intelligence EDA Highlights</w:t>
+      </w:r>
+    </w:p>
+    <w:p>
+      <w:r>
+        <w:t>The following exploratory visualizations summarize feature behaviour and cohort trends prior to and alongside model development.</w:t>
+      </w:r>
+    </w:p>
+    <w:p>
+      <w:r>
+        <w:drawing>
+          <wp:inline xmlns:a="http://schemas.openxmlformats.org/drawingml/2006/main" xmlns:pic="http://schemas.openxmlformats.org/drawingml/2006/picture">
+            <wp:extent cx="5394960" cy="1809608"/>
+            <wp:docPr id="14" name="Picture 14"/>
+            <wp:cNvGraphicFramePr>
+              <a:graphicFrameLocks noChangeAspect="1"/>
+            </wp:cNvGraphicFramePr>
+            <a:graphic>
+              <a:graphicData uri="http://schemas.openxmlformats.org/drawingml/2006/picture">
+                <pic:pic>
+                  <pic:nvPicPr>
+                    <pic:cNvPr id="0" name="03_bi_eda_distributions_and_correlation.png"/>
+                    <pic:cNvPicPr/>
+                  </pic:nvPicPr>
+                  <pic:blipFill>
+                    <a:blip r:embed="rId22"/>
+                    <a:stretch>
+                      <a:fillRect/>
+                    </a:stretch>
+                  </pic:blipFill>
+                  <pic:spPr>
+                    <a:xfrm>
+                      <a:off x="0" y="0"/>
+                      <a:ext cx="5394960" cy="1809608"/>
+                    </a:xfrm>
+                    <a:prstGeom prst="rect"/>
+                  </pic:spPr>
+                </pic:pic>
+              </a:graphicData>
+            </a:graphic>
+          </wp:inline>
+        </w:drawing>
+      </w:r>
+    </w:p>
+    <w:p>
+      <w:r>
+        <w:t>Figure: BI EDA visual showing GPA distribution by pass/fail and feature correlation heatmap.</w:t>
+      </w:r>
+    </w:p>
+    <w:p>
+      <w:r>
+        <w:drawing>
+          <wp:inline xmlns:a="http://schemas.openxmlformats.org/drawingml/2006/main" xmlns:pic="http://schemas.openxmlformats.org/drawingml/2006/picture">
+            <wp:extent cx="5394960" cy="2975084"/>
+            <wp:docPr id="15" name="Picture 15"/>
+            <wp:cNvGraphicFramePr>
+              <a:graphicFrameLocks noChangeAspect="1"/>
+            </wp:cNvGraphicFramePr>
+            <a:graphic>
+              <a:graphicData uri="http://schemas.openxmlformats.org/drawingml/2006/picture">
+                <pic:pic>
+                  <pic:nvPicPr>
+                    <pic:cNvPr id="0" name="04_bi_program_pass_rate.png"/>
+                    <pic:cNvPicPr/>
+                  </pic:nvPicPr>
+                  <pic:blipFill>
+                    <a:blip r:embed="rId23"/>
+                    <a:stretch>
+                      <a:fillRect/>
+                    </a:stretch>
+                  </pic:blipFill>
+                  <pic:spPr>
+                    <a:xfrm>
+                      <a:off x="0" y="0"/>
+                      <a:ext cx="5394960" cy="2975084"/>
+                    </a:xfrm>
+                    <a:prstGeom prst="rect"/>
+                  </pic:spPr>
+                </pic:pic>
+              </a:graphicData>
+            </a:graphic>
+          </wp:inline>
+        </w:drawing>
+      </w:r>
+    </w:p>
+    <w:p>
+      <w:r>
+        <w:t>Figure: BI EDA visual showing program-level pass rate comparison.</w:t>
+      </w:r>
+    </w:p>
+    <w:p>
+      <w:pPr>
         <w:pStyle w:val="Heading1"/>
       </w:pPr>
       <w:r>
@@ -1034,6 +1129,106 @@
         <w:pStyle w:val="Heading1"/>
       </w:pPr>
       <w:r>
+        <w:t>Appendices</w:t>
+      </w:r>
+    </w:p>
+    <w:p>
+      <w:r>
+        <w:t>Appendix A: Directory tree (app.py, pages/, utils/, data/, models/). Appendix B: API-free architecture because Streamlit embeds server logic. Appendix C: evaluation_metrics.json stores raw metrics for audits.</w:t>
+      </w:r>
+    </w:p>
+    <w:p>
+      <w:r>
+        <w:t>Appendix D: Notebook evidence screenshots.</w:t>
+      </w:r>
+    </w:p>
+    <w:p>
+      <w:r>
+        <w:drawing>
+          <wp:inline xmlns:a="http://schemas.openxmlformats.org/drawingml/2006/main" xmlns:pic="http://schemas.openxmlformats.org/drawingml/2006/picture">
+            <wp:extent cx="5394960" cy="1702037"/>
+            <wp:docPr id="16" name="Picture 16"/>
+            <wp:cNvGraphicFramePr>
+              <a:graphicFrameLocks noChangeAspect="1"/>
+            </wp:cNvGraphicFramePr>
+            <a:graphic>
+              <a:graphicData uri="http://schemas.openxmlformats.org/drawingml/2006/picture">
+                <pic:pic>
+                  <pic:nvPicPr>
+                    <pic:cNvPr id="0" name="01_model_metrics_table.png"/>
+                    <pic:cNvPicPr/>
+                  </pic:nvPicPr>
+                  <pic:blipFill>
+                    <a:blip r:embed="rId24"/>
+                    <a:stretch>
+                      <a:fillRect/>
+                    </a:stretch>
+                  </pic:blipFill>
+                  <pic:spPr>
+                    <a:xfrm>
+                      <a:off x="0" y="0"/>
+                      <a:ext cx="5394960" cy="1702037"/>
+                    </a:xfrm>
+                    <a:prstGeom prst="rect"/>
+                  </pic:spPr>
+                </pic:pic>
+              </a:graphicData>
+            </a:graphic>
+          </wp:inline>
+        </w:drawing>
+      </w:r>
+    </w:p>
+    <w:p>
+      <w:r>
+        <w:t>Figure: Notebook model metrics table export.</w:t>
+      </w:r>
+    </w:p>
+    <w:p>
+      <w:r>
+        <w:drawing>
+          <wp:inline xmlns:a="http://schemas.openxmlformats.org/drawingml/2006/main" xmlns:pic="http://schemas.openxmlformats.org/drawingml/2006/picture">
+            <wp:extent cx="5394960" cy="2116103"/>
+            <wp:docPr id="17" name="Picture 17"/>
+            <wp:cNvGraphicFramePr>
+              <a:graphicFrameLocks noChangeAspect="1"/>
+            </wp:cNvGraphicFramePr>
+            <a:graphic>
+              <a:graphicData uri="http://schemas.openxmlformats.org/drawingml/2006/picture">
+                <pic:pic>
+                  <pic:nvPicPr>
+                    <pic:cNvPr id="0" name="02_feature_importance_table.png"/>
+                    <pic:cNvPicPr/>
+                  </pic:nvPicPr>
+                  <pic:blipFill>
+                    <a:blip r:embed="rId25"/>
+                    <a:stretch>
+                      <a:fillRect/>
+                    </a:stretch>
+                  </pic:blipFill>
+                  <pic:spPr>
+                    <a:xfrm>
+                      <a:off x="0" y="0"/>
+                      <a:ext cx="5394960" cy="2116103"/>
+                    </a:xfrm>
+                    <a:prstGeom prst="rect"/>
+                  </pic:spPr>
+                </pic:pic>
+              </a:graphicData>
+            </a:graphic>
+          </wp:inline>
+        </w:drawing>
+      </w:r>
+    </w:p>
+    <w:p>
+      <w:r>
+        <w:t>Figure: Notebook feature importance table export.</w:t>
+      </w:r>
+    </w:p>
+    <w:p>
+      <w:pPr>
+        <w:pStyle w:val="Heading1"/>
+      </w:pPr>
+      <w:r>
         <w:t>Contributors</w:t>
       </w:r>
     </w:p>
@@ -1073,103 +1268,8 @@
       </w:r>
     </w:p>
     <w:p>
-      <w:pPr>
-        <w:pStyle w:val="Heading1"/>
-      </w:pPr>
       <w:r>
-        <w:t>Appendices</w:t>
-      </w:r>
-    </w:p>
-    <w:p>
-      <w:r>
-        <w:t>Appendix A: Directory tree (app.py, pages/, utils/, data/, models/). Appendix B: API-free architecture because Streamlit embeds server logic. Appendix C: evaluation_metrics.json stores raw metrics for audits.</w:t>
-      </w:r>
-    </w:p>
-    <w:p>
-      <w:r>
-        <w:t>Appendix D: Notebook evidence screenshots.</w:t>
-      </w:r>
-    </w:p>
-    <w:p>
-      <w:r>
-        <w:drawing>
-          <wp:inline xmlns:a="http://schemas.openxmlformats.org/drawingml/2006/main" xmlns:pic="http://schemas.openxmlformats.org/drawingml/2006/picture">
-            <wp:extent cx="5394960" cy="1702037"/>
-            <wp:docPr id="14" name="Picture 14"/>
-            <wp:cNvGraphicFramePr>
-              <a:graphicFrameLocks noChangeAspect="1"/>
-            </wp:cNvGraphicFramePr>
-            <a:graphic>
-              <a:graphicData uri="http://schemas.openxmlformats.org/drawingml/2006/picture">
-                <pic:pic>
-                  <pic:nvPicPr>
-                    <pic:cNvPr id="0" name="01_model_metrics_table.png"/>
-                    <pic:cNvPicPr/>
-                  </pic:nvPicPr>
-                  <pic:blipFill>
-                    <a:blip r:embed="rId22"/>
-                    <a:stretch>
-                      <a:fillRect/>
-                    </a:stretch>
-                  </pic:blipFill>
-                  <pic:spPr>
-                    <a:xfrm>
-                      <a:off x="0" y="0"/>
-                      <a:ext cx="5394960" cy="1702037"/>
-                    </a:xfrm>
-                    <a:prstGeom prst="rect"/>
-                  </pic:spPr>
-                </pic:pic>
-              </a:graphicData>
-            </a:graphic>
-          </wp:inline>
-        </w:drawing>
-      </w:r>
-    </w:p>
-    <w:p>
-      <w:r>
-        <w:t>Figure: Notebook model metrics table export.</w:t>
-      </w:r>
-    </w:p>
-    <w:p>
-      <w:r>
-        <w:drawing>
-          <wp:inline xmlns:a="http://schemas.openxmlformats.org/drawingml/2006/main" xmlns:pic="http://schemas.openxmlformats.org/drawingml/2006/picture">
-            <wp:extent cx="5394960" cy="2116103"/>
-            <wp:docPr id="15" name="Picture 15"/>
-            <wp:cNvGraphicFramePr>
-              <a:graphicFrameLocks noChangeAspect="1"/>
-            </wp:cNvGraphicFramePr>
-            <a:graphic>
-              <a:graphicData uri="http://schemas.openxmlformats.org/drawingml/2006/picture">
-                <pic:pic>
-                  <pic:nvPicPr>
-                    <pic:cNvPr id="0" name="02_feature_importance_table.png"/>
-                    <pic:cNvPicPr/>
-                  </pic:nvPicPr>
-                  <pic:blipFill>
-                    <a:blip r:embed="rId23"/>
-                    <a:stretch>
-                      <a:fillRect/>
-                    </a:stretch>
-                  </pic:blipFill>
-                  <pic:spPr>
-                    <a:xfrm>
-                      <a:off x="0" y="0"/>
-                      <a:ext cx="5394960" cy="2116103"/>
-                    </a:xfrm>
-                    <a:prstGeom prst="rect"/>
-                  </pic:spPr>
-                </pic:pic>
-              </a:graphicData>
-            </a:graphic>
-          </wp:inline>
-        </w:drawing>
-      </w:r>
-    </w:p>
-    <w:p>
-      <w:r>
-        <w:t>Figure: Notebook feature importance table export.</w:t>
+        <w:t>Emmanuel Cudjoe - F.CM.41.020.095.23</w:t>
       </w:r>
     </w:p>
     <w:sectPr>

</xml_diff>